<commit_message>
corrected end date with MC
</commit_message>
<xml_diff>
--- a/src/assets/resume.docx
+++ b/src/assets/resume.docx
@@ -4,7 +4,7 @@
   <w:body>
     <w:p>
       <w:pPr>
-        <w:pStyle w:val="Normal1"/>
+        <w:pStyle w:val="LOnormal"/>
         <w:jc w:val="right"/>
         <w:rPr>
           <w:b/>
@@ -26,7 +26,7 @@
     </w:p>
     <w:p>
       <w:pPr>
-        <w:pStyle w:val="Normal1"/>
+        <w:pStyle w:val="LOnormal"/>
         <w:jc w:val="right"/>
         <w:rPr>
           <w:rFonts w:ascii="Arial" w:hAnsi="Arial" w:eastAsia="Arial" w:cs="Arial"/>
@@ -49,7 +49,7 @@
     </w:p>
     <w:p>
       <w:pPr>
-        <w:pStyle w:val="Normal1"/>
+        <w:pStyle w:val="LOnormal"/>
         <w:jc w:val="right"/>
         <w:rPr>
           <w:rFonts w:ascii="Arial" w:hAnsi="Arial" w:eastAsia="Arial" w:cs="Arial"/>
@@ -82,18 +82,7 @@
           <w:sz w:val="20"/>
           <w:szCs w:val="20"/>
         </w:rPr>
-        <w:t xml:space="preserve"> </w:t>
-      </w:r>
-      <w:r>
-        <w:rPr>
-          <w:rFonts w:eastAsia="Arial" w:cs="Arial" w:ascii="Arial" w:hAnsi="Arial"/>
-          <w:b/>
-          <w:smallCaps/>
-          <w:color w:val="000000"/>
-          <w:sz w:val="20"/>
-          <w:szCs w:val="20"/>
-        </w:rPr>
-        <w:t xml:space="preserve">| </w:t>
+        <w:t xml:space="preserve"> | </w:t>
       </w:r>
       <w:r>
         <w:rPr>
@@ -143,7 +132,7 @@
     </w:p>
     <w:p>
       <w:pPr>
-        <w:pStyle w:val="Normal1"/>
+        <w:pStyle w:val="LOnormal"/>
         <w:spacing w:lineRule="auto" w:line="276" w:before="28" w:after="28"/>
         <w:ind w:left="720" w:right="0" w:hanging="0"/>
         <w:rPr>
@@ -163,7 +152,7 @@
     </w:p>
     <w:p>
       <w:pPr>
-        <w:pStyle w:val="Normal1"/>
+        <w:pStyle w:val="LOnormal"/>
         <w:spacing w:lineRule="auto" w:line="240" w:before="28" w:after="28"/>
         <w:ind w:left="720" w:right="0" w:hanging="0"/>
         <w:rPr>
@@ -178,7 +167,7 @@
     </w:p>
     <w:p>
       <w:pPr>
-        <w:pStyle w:val="Normal1"/>
+        <w:pStyle w:val="LOnormal"/>
         <w:spacing w:lineRule="auto" w:line="240" w:before="28" w:after="28"/>
         <w:rPr>
           <w:b/>
@@ -194,7 +183,7 @@
     </w:p>
     <w:p>
       <w:pPr>
-        <w:pStyle w:val="Normal1"/>
+        <w:pStyle w:val="LOnormal"/>
         <w:numPr>
           <w:ilvl w:val="0"/>
           <w:numId w:val="9"/>
@@ -219,7 +208,7 @@
     </w:p>
     <w:p>
       <w:pPr>
-        <w:pStyle w:val="Normal1"/>
+        <w:pStyle w:val="LOnormal"/>
         <w:numPr>
           <w:ilvl w:val="0"/>
           <w:numId w:val="9"/>
@@ -244,7 +233,7 @@
     </w:p>
     <w:p>
       <w:pPr>
-        <w:pStyle w:val="Normal1"/>
+        <w:pStyle w:val="LOnormal"/>
         <w:numPr>
           <w:ilvl w:val="0"/>
           <w:numId w:val="9"/>
@@ -269,7 +258,7 @@
     </w:p>
     <w:p>
       <w:pPr>
-        <w:pStyle w:val="Normal1"/>
+        <w:pStyle w:val="LOnormal"/>
         <w:numPr>
           <w:ilvl w:val="0"/>
           <w:numId w:val="9"/>
@@ -294,7 +283,7 @@
     </w:p>
     <w:p>
       <w:pPr>
-        <w:pStyle w:val="Normal1"/>
+        <w:pStyle w:val="LOnormal"/>
         <w:numPr>
           <w:ilvl w:val="0"/>
           <w:numId w:val="9"/>
@@ -343,7 +332,7 @@
     </w:p>
     <w:p>
       <w:pPr>
-        <w:pStyle w:val="Normal1"/>
+        <w:pStyle w:val="LOnormal"/>
         <w:spacing w:lineRule="auto" w:line="240" w:before="28" w:after="28"/>
         <w:ind w:left="720" w:right="0" w:hanging="0"/>
         <w:rPr>
@@ -364,7 +353,7 @@
     </w:p>
     <w:p>
       <w:pPr>
-        <w:pStyle w:val="Normal1"/>
+        <w:pStyle w:val="LOnormal"/>
         <w:numPr>
           <w:ilvl w:val="0"/>
           <w:numId w:val="12"/>
@@ -387,7 +376,7 @@
     </w:p>
     <w:p>
       <w:pPr>
-        <w:pStyle w:val="Normal1"/>
+        <w:pStyle w:val="LOnormal"/>
         <w:numPr>
           <w:ilvl w:val="0"/>
           <w:numId w:val="12"/>
@@ -410,7 +399,7 @@
     </w:p>
     <w:p>
       <w:pPr>
-        <w:pStyle w:val="Normal1"/>
+        <w:pStyle w:val="LOnormal"/>
         <w:spacing w:lineRule="auto" w:line="240" w:before="28" w:after="28"/>
         <w:ind w:left="720" w:right="0" w:hanging="0"/>
         <w:rPr>
@@ -431,7 +420,7 @@
     </w:p>
     <w:p>
       <w:pPr>
-        <w:pStyle w:val="Normal1"/>
+        <w:pStyle w:val="LOnormal"/>
         <w:numPr>
           <w:ilvl w:val="0"/>
           <w:numId w:val="3"/>
@@ -456,7 +445,7 @@
     </w:p>
     <w:p>
       <w:pPr>
-        <w:pStyle w:val="Normal1"/>
+        <w:pStyle w:val="LOnormal"/>
         <w:numPr>
           <w:ilvl w:val="0"/>
           <w:numId w:val="3"/>
@@ -481,7 +470,7 @@
     </w:p>
     <w:p>
       <w:pPr>
-        <w:pStyle w:val="Normal1"/>
+        <w:pStyle w:val="LOnormal"/>
         <w:spacing w:lineRule="auto" w:line="240" w:before="28" w:after="28"/>
         <w:ind w:left="720" w:right="0" w:hanging="0"/>
         <w:rPr>
@@ -502,7 +491,7 @@
     </w:p>
     <w:p>
       <w:pPr>
-        <w:pStyle w:val="Normal1"/>
+        <w:pStyle w:val="LOnormal"/>
         <w:numPr>
           <w:ilvl w:val="0"/>
           <w:numId w:val="11"/>
@@ -533,7 +522,7 @@
     </w:p>
     <w:p>
       <w:pPr>
-        <w:pStyle w:val="Normal1"/>
+        <w:pStyle w:val="LOnormal"/>
         <w:numPr>
           <w:ilvl w:val="0"/>
           <w:numId w:val="11"/>
@@ -556,7 +545,7 @@
     </w:p>
     <w:p>
       <w:pPr>
-        <w:pStyle w:val="Normal1"/>
+        <w:pStyle w:val="LOnormal"/>
         <w:numPr>
           <w:ilvl w:val="0"/>
           <w:numId w:val="11"/>
@@ -579,7 +568,7 @@
     </w:p>
     <w:p>
       <w:pPr>
-        <w:pStyle w:val="Normal1"/>
+        <w:pStyle w:val="LOnormal"/>
         <w:numPr>
           <w:ilvl w:val="0"/>
           <w:numId w:val="11"/>
@@ -602,7 +591,7 @@
     </w:p>
     <w:p>
       <w:pPr>
-        <w:pStyle w:val="Normal1"/>
+        <w:pStyle w:val="LOnormal"/>
         <w:numPr>
           <w:ilvl w:val="0"/>
           <w:numId w:val="11"/>
@@ -625,7 +614,7 @@
     </w:p>
     <w:p>
       <w:pPr>
-        <w:pStyle w:val="Normal1"/>
+        <w:pStyle w:val="LOnormal"/>
         <w:numPr>
           <w:ilvl w:val="0"/>
           <w:numId w:val="11"/>
@@ -648,7 +637,7 @@
     </w:p>
     <w:p>
       <w:pPr>
-        <w:pStyle w:val="Normal1"/>
+        <w:pStyle w:val="LOnormal"/>
         <w:spacing w:lineRule="auto" w:line="240" w:before="28" w:after="28"/>
         <w:ind w:left="720" w:right="0" w:hanging="0"/>
         <w:rPr>
@@ -669,7 +658,7 @@
     </w:p>
     <w:p>
       <w:pPr>
-        <w:pStyle w:val="Normal1"/>
+        <w:pStyle w:val="LOnormal"/>
         <w:numPr>
           <w:ilvl w:val="0"/>
           <w:numId w:val="1"/>
@@ -703,7 +692,7 @@
     </w:p>
     <w:p>
       <w:pPr>
-        <w:pStyle w:val="Normal1"/>
+        <w:pStyle w:val="LOnormal"/>
         <w:numPr>
           <w:ilvl w:val="0"/>
           <w:numId w:val="1"/>
@@ -737,7 +726,7 @@
     </w:p>
     <w:p>
       <w:pPr>
-        <w:pStyle w:val="Normal1"/>
+        <w:pStyle w:val="LOnormal"/>
         <w:spacing w:lineRule="auto" w:line="240" w:before="28" w:after="28"/>
         <w:ind w:left="720" w:right="0" w:hanging="0"/>
         <w:rPr>
@@ -760,7 +749,7 @@
     </w:p>
     <w:p>
       <w:pPr>
-        <w:pStyle w:val="Normal1"/>
+        <w:pStyle w:val="LOnormal"/>
         <w:numPr>
           <w:ilvl w:val="0"/>
           <w:numId w:val="6"/>
@@ -785,7 +774,7 @@
     </w:p>
     <w:p>
       <w:pPr>
-        <w:pStyle w:val="Normal1"/>
+        <w:pStyle w:val="LOnormal"/>
         <w:numPr>
           <w:ilvl w:val="0"/>
           <w:numId w:val="6"/>
@@ -810,7 +799,7 @@
     </w:p>
     <w:p>
       <w:pPr>
-        <w:pStyle w:val="Normal1"/>
+        <w:pStyle w:val="LOnormal"/>
         <w:numPr>
           <w:ilvl w:val="0"/>
           <w:numId w:val="6"/>
@@ -835,7 +824,7 @@
     </w:p>
     <w:p>
       <w:pPr>
-        <w:pStyle w:val="Normal1"/>
+        <w:pStyle w:val="LOnormal"/>
         <w:numPr>
           <w:ilvl w:val="0"/>
           <w:numId w:val="6"/>
@@ -860,7 +849,7 @@
     </w:p>
     <w:p>
       <w:pPr>
-        <w:pStyle w:val="Normal1"/>
+        <w:pStyle w:val="LOnormal"/>
         <w:numPr>
           <w:ilvl w:val="0"/>
           <w:numId w:val="6"/>
@@ -885,7 +874,7 @@
     </w:p>
     <w:p>
       <w:pPr>
-        <w:pStyle w:val="Normal1"/>
+        <w:pStyle w:val="LOnormal"/>
         <w:spacing w:lineRule="auto" w:line="276" w:before="28" w:after="28"/>
         <w:ind w:left="720" w:hanging="0"/>
         <w:rPr>
@@ -908,7 +897,7 @@
     </w:p>
     <w:p>
       <w:pPr>
-        <w:pStyle w:val="Normal1"/>
+        <w:pStyle w:val="LOnormal"/>
         <w:numPr>
           <w:ilvl w:val="0"/>
           <w:numId w:val="7"/>
@@ -933,7 +922,7 @@
     </w:p>
     <w:p>
       <w:pPr>
-        <w:pStyle w:val="Normal1"/>
+        <w:pStyle w:val="LOnormal"/>
         <w:numPr>
           <w:ilvl w:val="0"/>
           <w:numId w:val="7"/>
@@ -958,7 +947,7 @@
     </w:p>
     <w:p>
       <w:pPr>
-        <w:pStyle w:val="Normal1"/>
+        <w:pStyle w:val="LOnormal"/>
         <w:numPr>
           <w:ilvl w:val="0"/>
           <w:numId w:val="7"/>
@@ -983,7 +972,7 @@
     </w:p>
     <w:p>
       <w:pPr>
-        <w:pStyle w:val="Normal1"/>
+        <w:pStyle w:val="LOnormal"/>
         <w:spacing w:lineRule="auto" w:line="240" w:before="28" w:after="28"/>
         <w:ind w:right="0" w:hanging="0"/>
         <w:rPr>
@@ -1002,7 +991,7 @@
     </w:p>
     <w:p>
       <w:pPr>
-        <w:pStyle w:val="Normal1"/>
+        <w:pStyle w:val="LOnormal"/>
         <w:spacing w:lineRule="auto" w:line="240" w:before="28" w:after="28"/>
         <w:ind w:right="0" w:hanging="0"/>
         <w:rPr>
@@ -1021,7 +1010,7 @@
     </w:p>
     <w:p>
       <w:pPr>
-        <w:pStyle w:val="Normal1"/>
+        <w:pStyle w:val="LOnormal"/>
         <w:spacing w:lineRule="auto" w:line="276" w:before="0" w:after="0"/>
         <w:rPr>
           <w:b/>
@@ -1037,7 +1026,7 @@
     </w:p>
     <w:p>
       <w:pPr>
-        <w:pStyle w:val="Normal1"/>
+        <w:pStyle w:val="LOnormal"/>
         <w:spacing w:lineRule="auto" w:line="276" w:before="0" w:after="0"/>
         <w:rPr>
           <w:rFonts w:ascii="Arial" w:hAnsi="Arial" w:eastAsia="Arial" w:cs="Arial"/>
@@ -1062,7 +1051,7 @@
           <w:sz w:val="18"/>
           <w:szCs w:val="18"/>
         </w:rPr>
-        <w:t xml:space="preserve">MAR </w:t>
+        <w:t xml:space="preserve">MAR 2023 – </w:t>
       </w:r>
       <w:r>
         <w:rPr>
@@ -1071,7 +1060,7 @@
           <w:sz w:val="18"/>
           <w:szCs w:val="18"/>
         </w:rPr>
-        <w:t>2023</w:t>
+        <w:t>DEC</w:t>
       </w:r>
       <w:r>
         <w:rPr>
@@ -1080,16 +1069,7 @@
           <w:sz w:val="18"/>
           <w:szCs w:val="18"/>
         </w:rPr>
-        <w:t xml:space="preserve"> – </w:t>
-      </w:r>
-      <w:r>
-        <w:rPr>
-          <w:rFonts w:eastAsia="Arial" w:cs="Arial" w:ascii="Arial" w:hAnsi="Arial"/>
-          <w:b/>
-          <w:sz w:val="18"/>
-          <w:szCs w:val="18"/>
-        </w:rPr>
-        <w:t>JUN2024</w:t>
+        <w:t>2024</w:t>
       </w:r>
       <w:r>
         <w:rPr>
@@ -1154,7 +1134,7 @@
     </w:p>
     <w:p>
       <w:pPr>
-        <w:pStyle w:val="Normal1"/>
+        <w:pStyle w:val="LOnormal"/>
         <w:numPr>
           <w:ilvl w:val="0"/>
           <w:numId w:val="2"/>
@@ -1178,7 +1158,7 @@
     </w:p>
     <w:p>
       <w:pPr>
-        <w:pStyle w:val="Normal1"/>
+        <w:pStyle w:val="LOnormal"/>
         <w:spacing w:lineRule="auto" w:line="276" w:before="0" w:after="0"/>
         <w:rPr>
           <w:rFonts w:ascii="Arial" w:hAnsi="Arial" w:eastAsia="Arial" w:cs="Arial"/>
@@ -1268,7 +1248,7 @@
     </w:p>
     <w:p>
       <w:pPr>
-        <w:pStyle w:val="Normal1"/>
+        <w:pStyle w:val="LOnormal"/>
         <w:numPr>
           <w:ilvl w:val="0"/>
           <w:numId w:val="2"/>
@@ -1292,7 +1272,7 @@
     </w:p>
     <w:p>
       <w:pPr>
-        <w:pStyle w:val="Normal1"/>
+        <w:pStyle w:val="LOnormal"/>
         <w:spacing w:lineRule="auto" w:line="276" w:before="28" w:after="28"/>
         <w:ind w:left="720" w:hanging="0"/>
         <w:rPr>
@@ -1313,7 +1293,7 @@
     </w:p>
     <w:p>
       <w:pPr>
-        <w:pStyle w:val="Normal1"/>
+        <w:pStyle w:val="LOnormal"/>
         <w:numPr>
           <w:ilvl w:val="0"/>
           <w:numId w:val="18"/>
@@ -1338,7 +1318,7 @@
     </w:p>
     <w:p>
       <w:pPr>
-        <w:pStyle w:val="Normal1"/>
+        <w:pStyle w:val="LOnormal"/>
         <w:spacing w:lineRule="auto" w:line="276" w:before="0" w:after="0"/>
         <w:rPr>
           <w:rFonts w:ascii="Arial" w:hAnsi="Arial" w:eastAsia="Arial" w:cs="Arial"/>
@@ -1413,7 +1393,7 @@
     </w:p>
     <w:p>
       <w:pPr>
-        <w:pStyle w:val="Normal1"/>
+        <w:pStyle w:val="LOnormal"/>
         <w:numPr>
           <w:ilvl w:val="0"/>
           <w:numId w:val="13"/>
@@ -1438,7 +1418,7 @@
     </w:p>
     <w:p>
       <w:pPr>
-        <w:pStyle w:val="Normal1"/>
+        <w:pStyle w:val="LOnormal"/>
         <w:spacing w:lineRule="auto" w:line="276" w:before="28" w:after="28"/>
         <w:ind w:left="720" w:hanging="0"/>
         <w:rPr>
@@ -1459,7 +1439,7 @@
     </w:p>
     <w:p>
       <w:pPr>
-        <w:pStyle w:val="Normal1"/>
+        <w:pStyle w:val="LOnormal"/>
         <w:numPr>
           <w:ilvl w:val="0"/>
           <w:numId w:val="5"/>
@@ -1484,7 +1464,7 @@
     </w:p>
     <w:p>
       <w:pPr>
-        <w:pStyle w:val="Normal1"/>
+        <w:pStyle w:val="LOnormal"/>
         <w:numPr>
           <w:ilvl w:val="0"/>
           <w:numId w:val="5"/>
@@ -1509,7 +1489,7 @@
     </w:p>
     <w:p>
       <w:pPr>
-        <w:pStyle w:val="Normal1"/>
+        <w:pStyle w:val="LOnormal"/>
         <w:spacing w:lineRule="auto" w:line="276" w:before="0" w:after="0"/>
         <w:rPr>
           <w:rFonts w:ascii="Arial" w:hAnsi="Arial" w:eastAsia="Arial" w:cs="Arial"/>
@@ -1573,7 +1553,7 @@
     </w:p>
     <w:p>
       <w:pPr>
-        <w:pStyle w:val="Normal1"/>
+        <w:pStyle w:val="LOnormal"/>
         <w:numPr>
           <w:ilvl w:val="0"/>
           <w:numId w:val="10"/>
@@ -1595,7 +1575,7 @@
     </w:p>
     <w:p>
       <w:pPr>
-        <w:pStyle w:val="Normal1"/>
+        <w:pStyle w:val="LOnormal"/>
         <w:numPr>
           <w:ilvl w:val="0"/>
           <w:numId w:val="10"/>
@@ -1626,7 +1606,7 @@
     </w:p>
     <w:p>
       <w:pPr>
-        <w:pStyle w:val="Normal1"/>
+        <w:pStyle w:val="LOnormal"/>
         <w:spacing w:lineRule="auto" w:line="276" w:before="28" w:after="28"/>
         <w:ind w:left="720" w:hanging="0"/>
         <w:rPr>
@@ -1647,7 +1627,7 @@
     </w:p>
     <w:p>
       <w:pPr>
-        <w:pStyle w:val="Normal1"/>
+        <w:pStyle w:val="LOnormal"/>
         <w:numPr>
           <w:ilvl w:val="0"/>
           <w:numId w:val="8"/>
@@ -1670,7 +1650,7 @@
     </w:p>
     <w:p>
       <w:pPr>
-        <w:pStyle w:val="Normal1"/>
+        <w:pStyle w:val="LOnormal"/>
         <w:numPr>
           <w:ilvl w:val="0"/>
           <w:numId w:val="8"/>
@@ -1693,7 +1673,7 @@
     </w:p>
     <w:p>
       <w:pPr>
-        <w:pStyle w:val="Normal1"/>
+        <w:pStyle w:val="LOnormal"/>
         <w:spacing w:lineRule="auto" w:line="276" w:before="28" w:after="28"/>
         <w:ind w:left="720" w:right="0" w:hanging="0"/>
         <w:rPr>
@@ -1714,7 +1694,7 @@
     </w:p>
     <w:p>
       <w:pPr>
-        <w:pStyle w:val="Normal1"/>
+        <w:pStyle w:val="LOnormal"/>
         <w:numPr>
           <w:ilvl w:val="0"/>
           <w:numId w:val="16"/>
@@ -1737,7 +1717,7 @@
     </w:p>
     <w:p>
       <w:pPr>
-        <w:pStyle w:val="Normal1"/>
+        <w:pStyle w:val="LOnormal"/>
         <w:numPr>
           <w:ilvl w:val="0"/>
           <w:numId w:val="16"/>
@@ -1760,7 +1740,7 @@
     </w:p>
     <w:p>
       <w:pPr>
-        <w:pStyle w:val="Normal1"/>
+        <w:pStyle w:val="LOnormal"/>
         <w:spacing w:lineRule="auto" w:line="276" w:before="0" w:after="0"/>
         <w:rPr>
           <w:rFonts w:ascii="Arial" w:hAnsi="Arial" w:eastAsia="Arial" w:cs="Arial"/>
@@ -1781,7 +1761,7 @@
     </w:p>
     <w:p>
       <w:pPr>
-        <w:pStyle w:val="Normal1"/>
+        <w:pStyle w:val="LOnormal"/>
         <w:spacing w:lineRule="auto" w:line="276" w:before="0" w:after="0"/>
         <w:rPr>
           <w:rFonts w:ascii="Arial" w:hAnsi="Arial" w:eastAsia="Arial" w:cs="Arial"/>
@@ -1802,7 +1782,7 @@
     </w:p>
     <w:p>
       <w:pPr>
-        <w:pStyle w:val="Normal1"/>
+        <w:pStyle w:val="LOnormal"/>
         <w:spacing w:lineRule="auto" w:line="276" w:before="0" w:after="0"/>
         <w:rPr>
           <w:rFonts w:ascii="Arial" w:hAnsi="Arial" w:eastAsia="Arial" w:cs="Arial"/>
@@ -1823,7 +1803,7 @@
     </w:p>
     <w:p>
       <w:pPr>
-        <w:pStyle w:val="Normal1"/>
+        <w:pStyle w:val="LOnormal"/>
         <w:spacing w:lineRule="auto" w:line="276" w:before="0" w:after="0"/>
         <w:rPr>
           <w:rFonts w:ascii="Arial" w:hAnsi="Arial" w:eastAsia="Arial" w:cs="Arial"/>
@@ -1844,7 +1824,7 @@
     </w:p>
     <w:p>
       <w:pPr>
-        <w:pStyle w:val="Normal1"/>
+        <w:pStyle w:val="LOnormal"/>
         <w:spacing w:lineRule="auto" w:line="276" w:before="0" w:after="0"/>
         <w:rPr>
           <w:rFonts w:ascii="Arial" w:hAnsi="Arial" w:eastAsia="Arial" w:cs="Arial"/>
@@ -1865,7 +1845,7 @@
     </w:p>
     <w:p>
       <w:pPr>
-        <w:pStyle w:val="Normal1"/>
+        <w:pStyle w:val="LOnormal"/>
         <w:spacing w:lineRule="auto" w:line="276" w:before="0" w:after="0"/>
         <w:rPr>
           <w:rFonts w:ascii="Arial" w:hAnsi="Arial" w:eastAsia="Arial" w:cs="Arial"/>
@@ -1934,7 +1914,7 @@
     </w:p>
     <w:p>
       <w:pPr>
-        <w:pStyle w:val="Normal1"/>
+        <w:pStyle w:val="LOnormal"/>
         <w:numPr>
           <w:ilvl w:val="0"/>
           <w:numId w:val="17"/>
@@ -1957,7 +1937,7 @@
     </w:p>
     <w:p>
       <w:pPr>
-        <w:pStyle w:val="Normal1"/>
+        <w:pStyle w:val="LOnormal"/>
         <w:numPr>
           <w:ilvl w:val="0"/>
           <w:numId w:val="17"/>
@@ -1980,7 +1960,7 @@
     </w:p>
     <w:p>
       <w:pPr>
-        <w:pStyle w:val="Normal1"/>
+        <w:pStyle w:val="LOnormal"/>
         <w:numPr>
           <w:ilvl w:val="0"/>
           <w:numId w:val="17"/>
@@ -2003,7 +1983,7 @@
     </w:p>
     <w:p>
       <w:pPr>
-        <w:pStyle w:val="Normal1"/>
+        <w:pStyle w:val="LOnormal"/>
         <w:numPr>
           <w:ilvl w:val="0"/>
           <w:numId w:val="17"/>
@@ -2026,7 +2006,7 @@
     </w:p>
     <w:p>
       <w:pPr>
-        <w:pStyle w:val="Normal1"/>
+        <w:pStyle w:val="LOnormal"/>
         <w:numPr>
           <w:ilvl w:val="0"/>
           <w:numId w:val="17"/>
@@ -2049,7 +2029,7 @@
     </w:p>
     <w:p>
       <w:pPr>
-        <w:pStyle w:val="Normal1"/>
+        <w:pStyle w:val="LOnormal"/>
         <w:spacing w:lineRule="auto" w:line="276" w:before="28" w:after="28"/>
         <w:ind w:left="720" w:right="0" w:hanging="0"/>
         <w:rPr>
@@ -2070,7 +2050,7 @@
     </w:p>
     <w:p>
       <w:pPr>
-        <w:pStyle w:val="Normal1"/>
+        <w:pStyle w:val="LOnormal"/>
         <w:numPr>
           <w:ilvl w:val="0"/>
           <w:numId w:val="14"/>
@@ -2093,7 +2073,7 @@
     </w:p>
     <w:p>
       <w:pPr>
-        <w:pStyle w:val="Normal1"/>
+        <w:pStyle w:val="LOnormal"/>
         <w:numPr>
           <w:ilvl w:val="0"/>
           <w:numId w:val="14"/>
@@ -2130,7 +2110,7 @@
     </w:p>
     <w:p>
       <w:pPr>
-        <w:pStyle w:val="Normal1"/>
+        <w:pStyle w:val="LOnormal"/>
         <w:numPr>
           <w:ilvl w:val="0"/>
           <w:numId w:val="14"/>
@@ -2161,7 +2141,7 @@
     </w:p>
     <w:p>
       <w:pPr>
-        <w:pStyle w:val="Normal1"/>
+        <w:pStyle w:val="LOnormal"/>
         <w:spacing w:lineRule="auto" w:line="276" w:before="28" w:after="28"/>
         <w:ind w:left="720" w:right="0" w:hanging="0"/>
         <w:rPr>
@@ -2182,7 +2162,7 @@
     </w:p>
     <w:p>
       <w:pPr>
-        <w:pStyle w:val="Normal1"/>
+        <w:pStyle w:val="LOnormal"/>
         <w:numPr>
           <w:ilvl w:val="0"/>
           <w:numId w:val="15"/>
@@ -2205,7 +2185,7 @@
     </w:p>
     <w:p>
       <w:pPr>
-        <w:pStyle w:val="Normal1"/>
+        <w:pStyle w:val="LOnormal"/>
         <w:numPr>
           <w:ilvl w:val="0"/>
           <w:numId w:val="15"/>
@@ -2236,7 +2216,7 @@
     </w:p>
     <w:p>
       <w:pPr>
-        <w:pStyle w:val="Normal1"/>
+        <w:pStyle w:val="LOnormal"/>
         <w:numPr>
           <w:ilvl w:val="0"/>
           <w:numId w:val="15"/>
@@ -2259,7 +2239,7 @@
     </w:p>
     <w:p>
       <w:pPr>
-        <w:pStyle w:val="Normal1"/>
+        <w:pStyle w:val="LOnormal"/>
         <w:numPr>
           <w:ilvl w:val="0"/>
           <w:numId w:val="15"/>
@@ -2282,7 +2262,7 @@
     </w:p>
     <w:p>
       <w:pPr>
-        <w:pStyle w:val="Normal1"/>
+        <w:pStyle w:val="LOnormal"/>
         <w:spacing w:lineRule="auto" w:line="240" w:before="28" w:after="28"/>
         <w:rPr>
           <w:rFonts w:ascii="Arial" w:hAnsi="Arial" w:eastAsia="Arial" w:cs="Arial"/>
@@ -2305,7 +2285,7 @@
     </w:p>
     <w:p>
       <w:pPr>
-        <w:pStyle w:val="Normal1"/>
+        <w:pStyle w:val="LOnormal"/>
         <w:spacing w:lineRule="auto" w:line="276"/>
         <w:rPr>
           <w:rFonts w:ascii="Arial" w:hAnsi="Arial" w:eastAsia="Arial" w:cs="Arial"/>
@@ -2324,7 +2304,7 @@
     </w:p>
     <w:p>
       <w:pPr>
-        <w:pStyle w:val="Normal1"/>
+        <w:pStyle w:val="LOnormal"/>
         <w:spacing w:lineRule="auto" w:line="240" w:before="0" w:after="292"/>
         <w:ind w:left="0" w:right="0" w:hanging="0"/>
         <w:rPr>
@@ -2343,7 +2323,7 @@
     </w:p>
     <w:p>
       <w:pPr>
-        <w:pStyle w:val="Normal1"/>
+        <w:pStyle w:val="LOnormal"/>
         <w:rPr>
           <w:rFonts w:ascii="Arial" w:hAnsi="Arial" w:eastAsia="Arial" w:cs="Arial"/>
           <w:i/>
@@ -2380,7 +2360,7 @@
     </w:p>
     <w:p>
       <w:pPr>
-        <w:pStyle w:val="Normal1"/>
+        <w:pStyle w:val="LOnormal"/>
         <w:spacing w:lineRule="auto" w:line="276" w:before="28" w:after="28"/>
         <w:ind w:left="720" w:right="0" w:hanging="0"/>
         <w:rPr>
@@ -2401,7 +2381,7 @@
     </w:p>
     <w:p>
       <w:pPr>
-        <w:pStyle w:val="Normal1"/>
+        <w:pStyle w:val="LOnormal"/>
         <w:numPr>
           <w:ilvl w:val="0"/>
           <w:numId w:val="4"/>
@@ -2426,7 +2406,7 @@
     </w:p>
     <w:p>
       <w:pPr>
-        <w:pStyle w:val="Normal1"/>
+        <w:pStyle w:val="LOnormal"/>
         <w:numPr>
           <w:ilvl w:val="0"/>
           <w:numId w:val="4"/>
@@ -2459,7 +2439,7 @@
     </w:p>
     <w:p>
       <w:pPr>
-        <w:pStyle w:val="Normal1"/>
+        <w:pStyle w:val="LOnormal"/>
         <w:numPr>
           <w:ilvl w:val="0"/>
           <w:numId w:val="4"/>
@@ -2482,7 +2462,7 @@
     </w:p>
     <w:p>
       <w:pPr>
-        <w:pStyle w:val="Normal1"/>
+        <w:pStyle w:val="LOnormal"/>
         <w:numPr>
           <w:ilvl w:val="0"/>
           <w:numId w:val="4"/>
@@ -2505,7 +2485,7 @@
     </w:p>
     <w:p>
       <w:pPr>
-        <w:pStyle w:val="Normal1"/>
+        <w:pStyle w:val="LOnormal"/>
         <w:spacing w:lineRule="auto" w:line="276" w:before="0" w:after="292"/>
         <w:ind w:left="1440" w:right="0" w:hanging="0"/>
         <w:rPr>
@@ -2537,7 +2517,7 @@
     </w:p>
     <w:p>
       <w:pPr>
-        <w:pStyle w:val="Normal1"/>
+        <w:pStyle w:val="LOnormal"/>
         <w:spacing w:lineRule="auto" w:line="240" w:before="28" w:after="292"/>
         <w:ind w:left="720" w:right="0" w:hanging="0"/>
         <w:rPr>
@@ -5431,8 +5411,8 @@
   </w:style>
   <w:style w:type="paragraph" w:styleId="Heading1">
     <w:name w:val="Heading 1"/>
-    <w:basedOn w:val="Normal1"/>
-    <w:next w:val="Normal1"/>
+    <w:basedOn w:val="LOnormal"/>
+    <w:next w:val="LOnormal"/>
     <w:qFormat/>
     <w:pPr>
       <w:keepNext w:val="true"/>
@@ -5448,8 +5428,8 @@
   </w:style>
   <w:style w:type="paragraph" w:styleId="Heading2">
     <w:name w:val="Heading 2"/>
-    <w:basedOn w:val="Normal1"/>
-    <w:next w:val="Normal1"/>
+    <w:basedOn w:val="LOnormal"/>
+    <w:next w:val="LOnormal"/>
     <w:qFormat/>
     <w:pPr>
       <w:keepNext w:val="true"/>
@@ -5465,8 +5445,8 @@
   </w:style>
   <w:style w:type="paragraph" w:styleId="Heading3">
     <w:name w:val="Heading 3"/>
-    <w:basedOn w:val="Normal1"/>
-    <w:next w:val="Normal1"/>
+    <w:basedOn w:val="LOnormal"/>
+    <w:next w:val="LOnormal"/>
     <w:qFormat/>
     <w:pPr>
       <w:keepNext w:val="true"/>
@@ -5482,8 +5462,8 @@
   </w:style>
   <w:style w:type="paragraph" w:styleId="Heading4">
     <w:name w:val="Heading 4"/>
-    <w:basedOn w:val="Normal1"/>
-    <w:next w:val="Normal1"/>
+    <w:basedOn w:val="LOnormal"/>
+    <w:next w:val="LOnormal"/>
     <w:qFormat/>
     <w:pPr>
       <w:keepNext w:val="true"/>
@@ -5499,8 +5479,8 @@
   </w:style>
   <w:style w:type="paragraph" w:styleId="Heading5">
     <w:name w:val="Heading 5"/>
-    <w:basedOn w:val="Normal1"/>
-    <w:next w:val="Normal1"/>
+    <w:basedOn w:val="LOnormal"/>
+    <w:next w:val="LOnormal"/>
     <w:qFormat/>
     <w:pPr>
       <w:keepNext w:val="true"/>
@@ -5516,8 +5496,8 @@
   </w:style>
   <w:style w:type="paragraph" w:styleId="Heading6">
     <w:name w:val="Heading 6"/>
-    <w:basedOn w:val="Normal1"/>
-    <w:next w:val="Normal1"/>
+    <w:basedOn w:val="LOnormal"/>
+    <w:next w:val="LOnormal"/>
     <w:qFormat/>
     <w:pPr>
       <w:keepNext w:val="true"/>
@@ -5567,7 +5547,7 @@
   </w:style>
   <w:style w:type="paragraph" w:styleId="Heading">
     <w:name w:val="Heading"/>
-    <w:basedOn w:val="Normal1"/>
+    <w:basedOn w:val="LOnormal"/>
     <w:next w:val="TextBody"/>
     <w:qFormat/>
     <w:pPr>
@@ -5582,7 +5562,7 @@
   </w:style>
   <w:style w:type="paragraph" w:styleId="TextBody">
     <w:name w:val="Body Text"/>
-    <w:basedOn w:val="Normal1"/>
+    <w:basedOn w:val="LOnormal"/>
     <w:pPr>
       <w:spacing w:before="0" w:after="120"/>
     </w:pPr>
@@ -5596,7 +5576,7 @@
   </w:style>
   <w:style w:type="paragraph" w:styleId="Caption">
     <w:name w:val="Caption"/>
-    <w:basedOn w:val="Normal1"/>
+    <w:basedOn w:val="LOnormal"/>
     <w:qFormat/>
     <w:pPr>
       <w:suppressLineNumbers/>
@@ -5611,18 +5591,19 @@
   </w:style>
   <w:style w:type="paragraph" w:styleId="Index">
     <w:name w:val="Index"/>
-    <w:basedOn w:val="Normal1"/>
+    <w:basedOn w:val="LOnormal"/>
     <w:qFormat/>
     <w:pPr>
       <w:suppressLineNumbers/>
     </w:pPr>
     <w:rPr/>
   </w:style>
-  <w:style w:type="paragraph" w:styleId="Normal1" w:default="1">
+  <w:style w:type="paragraph" w:styleId="LOnormal" w:default="1">
     <w:name w:val="LO-normal"/>
     <w:qFormat/>
     <w:pPr>
       <w:widowControl/>
+      <w:suppressAutoHyphens w:val="true"/>
       <w:bidi w:val="0"/>
       <w:spacing w:before="0" w:after="0"/>
       <w:jc w:val="left"/>
@@ -5638,8 +5619,8 @@
   </w:style>
   <w:style w:type="paragraph" w:styleId="Title">
     <w:name w:val="Title"/>
-    <w:basedOn w:val="Normal1"/>
-    <w:next w:val="Normal1"/>
+    <w:basedOn w:val="LOnormal"/>
+    <w:next w:val="LOnormal"/>
     <w:qFormat/>
     <w:pPr>
       <w:keepNext w:val="true"/>
@@ -5655,7 +5636,7 @@
   </w:style>
   <w:style w:type="paragraph" w:styleId="ListParagraph">
     <w:name w:val="List Paragraph"/>
-    <w:basedOn w:val="Normal1"/>
+    <w:basedOn w:val="LOnormal"/>
     <w:qFormat/>
     <w:pPr>
       <w:ind w:left="720" w:right="0" w:hanging="0"/>
@@ -5664,8 +5645,8 @@
   </w:style>
   <w:style w:type="paragraph" w:styleId="Subtitle">
     <w:name w:val="Subtitle"/>
-    <w:basedOn w:val="Normal1"/>
-    <w:next w:val="Normal1"/>
+    <w:basedOn w:val="LOnormal"/>
+    <w:next w:val="LOnormal"/>
     <w:qFormat/>
     <w:pPr>
       <w:keepNext w:val="true"/>

</xml_diff>